<commit_message>
content: align site with CV and repos, add Maps links and new posts
Reword harness claims (Kiro CLI at work; Antigravity and Claude Code
personal), correct project stacks, make blog 01/02 generic, replace the
logged-in Maps link with shared coffee and taproom lists, fix water to
filtered, and add posts on open-lakehouse and fiduciary-agent.

Co-Authored-By: Claude Sonnet 5.5 <noreply@anthropic.com>
</commit_message>
<xml_diff>
--- a/public/Robin_Saini_CV.docx
+++ b/public/Robin_Saini_CV.docx
@@ -71,7 +71,7 @@
           <w:b w:val="0"/>
           <w:sz w:val="21"/>
         </w:rPr>
-        <w:t>Lead / Senior Data Engineer with 15+ years in software and data engineering (10+ in data engineering), delivering data engineering modernisation and transformation in regulated UK financial services. Hands-on every day in Python, PySpark, SQL and Airflow, with engineering standards, CI/CD and automated testing built into delivery. Led the team that built a large-scale Snowflake ESG data platform (50+ sources, 1TB+ monthly), cut batch processing times by 40% through PySpark and DBT optimisation, and designed and delivered an ML-ready data lake on AWS at Lloyds Banking Group. Currently lead the data engineering function for all agentic AI projects in an enterprise innovation team, taking work from proof of concept to production, and use AI coding assistants (Claude Code and Kiro CLI) extensively in day-to-day engineering. Defined team engineering standards and mentored junior engineers. A contractor who delivers quickly and works with architects, data scientists, platform teams and business stakeholders.</w:t>
+        <w:t>Lead / Senior Data Engineer with 15+ years in software and data engineering (10+ in data engineering), delivering data engineering modernisation and transformation in regulated UK financial services. Hands-on every day in Python, PySpark, SQL and Airflow, with engineering standards, CI/CD and automated testing built into delivery. Led the team that built a large-scale Snowflake ESG data platform (50+ sources, 1TB+ monthly), cut batch processing times by 40% through PySpark and DBT optimisation, and designed and delivered an ML-ready data lake on AWS at Lloyds Banking Group. Currently lead the data engineering function for all agentic AI projects in an enterprise innovation team, taking work from proof of concept to production, and use AI coding assistants (Kiro CLI at work; Claude Code and Google Antigravity on personal projects) extensively in day-to-day engineering. Defined team engineering standards and mentored junior engineers. A contractor who delivers quickly and works with architects, data scientists, platform teams and business stakeholders.</w:t>
       </w:r>
     </w:p>
     <w:p>
@@ -186,7 +186,7 @@
           <w:b w:val="0"/>
           <w:sz w:val="21"/>
         </w:rPr>
-        <w:t xml:space="preserve"> AI-assisted engineering (Claude Code, Kiro CLI); agent tool integration via reusable MCP servers; RAG / retrieval and context pipelines; OpenAI / Agents SDK, LangGraph; LLM-as-a-judge evaluation and AI observability</w:t>
+        <w:t xml:space="preserve"> AI-assisted engineering (Kiro CLI at work; Claude Code and Antigravity personally); agent tool integration via reusable MCP servers; RAG / retrieval and context pipelines; OpenAI / Agents SDK, LangGraph; LLM-as-a-judge evaluation and AI observability</w:t>
       </w:r>
     </w:p>
     <w:p>
@@ -403,7 +403,7 @@
           <w:b w:val="0"/>
           <w:sz w:val="21"/>
         </w:rPr>
-        <w:t>Use AI coding assistants (Claude Code and Kiro CLI) extensively in day-to-day engineering work.</w:t>
+        <w:t>Use AI coding assistants (Kiro CLI at work; Claude Code and Google Antigravity on personal projects) extensively in day-to-day engineering work.</w:t>
       </w:r>
     </w:p>
     <w:p>

</xml_diff>

<commit_message>
content: reframe around AI data engineering, correct Lloyds history, add case studies
Position the work as the data layer for AI agents (Kiro CLI at work,
Antigravity and Claude Code personal), add ESG platform and retail
data mart case studies, hold back the open-lakehouse post, correct the
Lloyds role (Teradata modernisation, BigQuery exploration), remove AWS
data lake claims, add the complaints timeline, batched jittered writer
section, F1 interest, and update the CV downloads.

Co-Authored-By: Claude Sonnet 5.5 <noreply@anthropic.com>
</commit_message>
<xml_diff>
--- a/public/Robin_Saini_CV.docx
+++ b/public/Robin_Saini_CV.docx
@@ -31,7 +31,7 @@
           <w:b w:val="0"/>
           <w:sz w:val="21"/>
         </w:rPr>
-        <w:t xml:space="preserve"> | Python | PySpark | Airflow | AWS | Snowflake | SQL | AI-assisted engineering</w:t>
+        <w:t xml:space="preserve"> | Python | PySpark | Airflow | Snowflake | SQL | AI-assisted engineering</w:t>
       </w:r>
     </w:p>
     <w:p>
@@ -71,7 +71,7 @@
           <w:b w:val="0"/>
           <w:sz w:val="21"/>
         </w:rPr>
-        <w:t>Lead / Senior Data Engineer with 15+ years in software and data engineering (10+ in data engineering), delivering data engineering modernisation and transformation in regulated UK financial services. Hands-on every day in Python, PySpark, SQL and Airflow, with engineering standards, CI/CD and automated testing built into delivery. Led the team that built a large-scale Snowflake ESG data platform (50+ sources, 1TB+ monthly), cut batch processing times by 40% through PySpark and DBT optimisation, and designed and delivered an ML-ready data lake on AWS at Lloyds Banking Group. Currently lead the data engineering function for all agentic AI projects in an enterprise innovation team, taking work from proof of concept to production, and use AI coding assistants (Kiro CLI at work; Claude Code and Google Antigravity on personal projects) extensively in day-to-day engineering. Defined team engineering standards and mentored junior engineers. A contractor who delivers quickly and works with architects, data scientists, platform teams and business stakeholders.</w:t>
+        <w:t>Lead / Senior Data Engineer with 15+ years in software and data engineering (10+ in data engineering), delivering data engineering modernisation and transformation in regulated UK financial services. Hands-on every day in Python, PySpark, SQL and Airflow, with engineering standards, CI/CD and automated testing built into delivery. Led the team that built a large-scale Snowflake ESG data platform (50+ sources, 1TB+ monthly), cut batch processing times by 40% through PySpark and DBT optimisation, and earlier worked on Teradata modernisation and a Google Cloud (BigQuery) proof of concept on the Lloyds Banking Group enterprise data platform. Currently lead the data engineering function for all agentic AI projects in an enterprise innovation team, taking work from proof of concept to production, and use AI coding assistants (Kiro CLI at work; Claude Code and Google Antigravity on personal projects) extensively in day-to-day engineering. Defined team engineering standards and mentored junior engineers. A contractor who delivers quickly and works with architects, data scientists, platform teams and business stakeholders.</w:t>
       </w:r>
     </w:p>
     <w:p>
@@ -126,7 +126,7 @@
           <w:b w:val="0"/>
           <w:sz w:val="21"/>
         </w:rPr>
-        <w:t xml:space="preserve"> AWS (S3, Glue, EMR, Athena, SageMaker; working level), GitLab CI/CD, Docker, Git, automated testing, Terraform (maintaining configuration)</w:t>
+        <w:t xml:space="preserve"> AWS, GitLab CI/CD, Docker, Git, automated testing, Terraform (maintaining configuration)</w:t>
       </w:r>
     </w:p>
     <w:p>
@@ -260,7 +260,7 @@
           <w:b w:val="0"/>
           <w:sz w:val="21"/>
         </w:rPr>
-        <w:t>Designed and delivered an ML-ready data lake on AWS for Lloyds Banking Group data science programmes; 50% lower ETL load times and 45% fewer data errors on the enterprise data warehouse.</w:t>
+        <w:t>Teradata modernisation on the Lloyds Banking Group enterprise data platform, including exploring a move to BigQuery; 50% lower ETL load times and 45% fewer data errors on the enterprise data warehouse.</w:t>
       </w:r>
     </w:p>
     <w:p>
@@ -540,7 +540,7 @@
           <w:b w:val="0"/>
           <w:sz w:val="21"/>
         </w:rPr>
-        <w:t>Designed and delivered an ML-ready data lake on AWS serving Lloyds' data science programmes.</w:t>
+        <w:t>Part of the enterprise data platform team, mainly on Teradata modernisation, and explored a move to Google BigQuery through a proof of concept on Google Cloud Platform.</w:t>
       </w:r>
     </w:p>
     <w:p>

</xml_diff>

<commit_message>
content: update CV to latest version and sync site pages
Adds DAVE, Kafka LLM-as-a-judge evaluation, EMR Serverless monitoring,
MWAA/DBT platform detail and CLV work across the CV page, downloads,
projects registry and homepage skills.

Co-Authored-By: Claude Sonnet 5.5 <noreply@anthropic.com>
</commit_message>
<xml_diff>
--- a/public/Robin_Saini_CV.docx
+++ b/public/Robin_Saini_CV.docx
@@ -106,7 +106,7 @@
           <w:b w:val="0"/>
           <w:sz w:val="21"/>
         </w:rPr>
-        <w:t xml:space="preserve"> Python (advanced), PySpark / Apache Spark, Apache Airflow, SQL (expert), DBT, StreamSets, batch ELT/ETL at scale</w:t>
+        <w:t xml:space="preserve"> Python (advanced), PySpark / Apache Spark (incl. AWS EMR Serverless), Apache Airflow, SQL (expert), DBT, StreamSets, batch ELT/ETL at scale</w:t>
       </w:r>
     </w:p>
     <w:p>
@@ -234,7 +234,7 @@
           <w:b w:val="0"/>
           <w:sz w:val="21"/>
         </w:rPr>
-        <w:t>40% faster batch processing (PySpark and DBT) and 30% fewer data quality incidents.</w:t>
+        <w:t>Agentic AI delivery (current NatWest innovation team): built the data engineering behind DAVE and the model-evaluation microservice, cutting manual case-handling time by over 90% and supporting quality checks on 300+ commercial onboarding applications a day.</w:t>
       </w:r>
     </w:p>
     <w:p>
@@ -247,7 +247,7 @@
           <w:b w:val="0"/>
           <w:sz w:val="21"/>
         </w:rPr>
-        <w:t>Led the team delivering a 50+ source, 1TB+/month Snowflake ESG and climate data platform for analytics and regulatory reporting.</w:t>
+        <w:t>Led the team delivering a 50+ source, 1TB+/month Snowflake ESG and climate data platform (layered DBT, Airflow on AWS MWAA) for analytics and regulatory reporting at NatWest.</w:t>
       </w:r>
     </w:p>
     <w:p>
@@ -260,7 +260,7 @@
           <w:b w:val="0"/>
           <w:sz w:val="21"/>
         </w:rPr>
-        <w:t>Teradata modernisation on the Lloyds Banking Group enterprise data platform, including exploring a move to BigQuery; 50% lower ETL load times and 45% fewer data errors on the enterprise data warehouse.</w:t>
+        <w:t>40% faster batch processing (PySpark and DBT) and 30% fewer data quality incidents on NatWest data platforms.</w:t>
       </w:r>
     </w:p>
     <w:p>
@@ -273,7 +273,7 @@
           <w:b w:val="0"/>
           <w:sz w:val="21"/>
         </w:rPr>
-        <w:t>Agentic AI delivery: cut manual case-handling time by over 90% and supported quality checks on 300+ commercial onboarding applications a day.</w:t>
+        <w:t>Earlier (Lloyds Banking Group): Teradata modernisation with a BigQuery proof of concept; 50% lower ETL load times and 45% fewer data errors on the enterprise data warehouse.</w:t>
       </w:r>
     </w:p>
     <w:p>
@@ -312,7 +312,7 @@
           <w:b w:val="0"/>
           <w:sz w:val="21"/>
         </w:rPr>
-        <w:t>Lead the data engineering function for all agentic AI projects in an enterprise innovation team, from proof of concept to production.</w:t>
+        <w:t>Lead the data engineering function across the enterprise innovation team's agentic AI products — DAVE (Decision Assist for complaints), the LLM-as-a-judge evaluation microservice, and the Colleague Assist / CAI contact-centre programme — taking work from proof of concept to production.</w:t>
       </w:r>
     </w:p>
     <w:p>
@@ -338,7 +338,20 @@
           <w:b w:val="0"/>
           <w:sz w:val="21"/>
         </w:rPr>
-        <w:t>Orchestrate workflows with Airflow across enterprise microservices, Snowflake, PostgreSQL and PCF; built Splunk observability for agent execution, tool-call performance and decision quality.</w:t>
+        <w:t>Orchestrate workflows with Airflow across enterprise microservices, Snowflake, PostgreSQL and PCF; built a near-real-time Kafka → LLM-as-a-judge evaluation pipeline (with batch REST path) scoring model decisions and writing metrics to Snowflake, and Splunk observability for agent execution, tool-call performance and decision quality.</w:t>
+      </w:r>
+    </w:p>
+    <w:p>
+      <w:pPr>
+        <w:pStyle w:val="ListBullet"/>
+        <w:spacing w:after="20"/>
+      </w:pPr>
+      <w:r>
+        <w:rPr>
+          <w:b w:val="0"/>
+          <w:sz w:val="21"/>
+        </w:rPr>
+        <w:t>Built PySpark pipelines on AWS EMR Serverless for model monitoring: extract model inputs and outputs from PostgreSQL and on-prem sources to S3 (Parquet) and Snowflake, computing operational and ML performance metrics (accuracy, precision, recall, F1) plus LLM token-usage and latency tracking, orchestrated by Airflow.</w:t>
       </w:r>
     </w:p>
     <w:p>
@@ -364,7 +377,7 @@
           <w:b w:val="0"/>
           <w:sz w:val="21"/>
         </w:rPr>
-        <w:t>Delivered agentic investigation and decision-support workflows that cut manual case-handling time by over 90%, and an AI-assisted due-diligence capability supporting quality checks on 300+ commercial onboarding applications a day.</w:t>
+        <w:t>Built the data engineering behind DAVE's decision-support workflows (decision-outcome, compensation and fix-classification prediction, plus a graph-following fix-resolution agent) that cut manual case-handling time by over 90%, and an AI-assisted due-diligence capability supporting quality checks on 300+ commercial onboarding applications a day.</w:t>
       </w:r>
     </w:p>
     <w:p>
@@ -377,7 +390,7 @@
           <w:b w:val="0"/>
           <w:sz w:val="21"/>
         </w:rPr>
-        <w:t>Designed and packaged reusable MCP servers consumed by multiple downstream agents with no data-access code, standardising agent access to enterprise systems and cutting integration effort.</w:t>
+        <w:t>Designed and packaged a reusable, PII-guardrailed MCP server (bounded JSON slices, role-based field allow-lists, full audit trail) consumed by multiple downstream agents with no data-access code — reused end-to-end by DAVE — standardising agent access to enterprise systems and cutting integration effort.</w:t>
       </w:r>
     </w:p>
     <w:p>
@@ -416,7 +429,7 @@
           <w:b w:val="0"/>
           <w:sz w:val="21"/>
         </w:rPr>
-        <w:t>Work with business stakeholders from discovery onwards; partner with ML Engineering, Data Science and Platform teams; deliver via GitLab CI/CD and Docker.</w:t>
+        <w:t>On the Colleague Assist / CAI contact-centre work, engineered Snowflake data models over AWS Connect call transcripts and contact-trace records (turn-timing and silence analytics) for the Data Science team. Work with business stakeholders from discovery onwards; partner with ML Engineering, Data Science and Platform teams; deliver via GitLab CI/CD and Docker.</w:t>
       </w:r>
     </w:p>
     <w:p>
@@ -440,7 +453,7 @@
           <w:b w:val="0"/>
           <w:sz w:val="21"/>
         </w:rPr>
-        <w:t>Led a team of Data Engineers delivering NatWest's ESG data platform on Snowflake: 50+ internal and external sources, 1TB+ of climate and ESG data processed monthly, for analytics and regulatory reporting.</w:t>
+        <w:t>Led a team of Data Engineers delivering NatWest's ESG and climate data platform on Snowflake: 50+ internal and external sources, 1TB+ processed monthly, for analytics and regulatory reporting. Built it as a layered DBT project (RAW → INT → PRS → presentation) orchestrated by Airflow on AWS MWAA.</w:t>
       </w:r>
     </w:p>
     <w:p>
@@ -466,7 +479,7 @@
           <w:b w:val="0"/>
           <w:sz w:val="21"/>
         </w:rPr>
-        <w:t>Reduced data quality incidents by 30% with automated monitoring and quality controls.</w:t>
+        <w:t>Reduced data quality incidents by 30% with metadata-driven ingestion (new sources onboarded by config, not code), idempotent duplicate-load guards for safe re-runs, DBT snapshots for full change history, and automated DBT tests.</w:t>
       </w:r>
     </w:p>
     <w:p>
@@ -479,7 +492,7 @@
           <w:b w:val="0"/>
           <w:sz w:val="21"/>
         </w:rPr>
-        <w:t>Worked with Data Architects and Data Scientists to deliver production climate risk models; defined team engineering standards and data product frameworks; mentored junior engineers.</w:t>
+        <w:t>Cut Snowflake compute cost with per-model warehouse routing and transient tables, and automated deployment of the DBT project to MWAA via a build-and-promote pipeline (Artifactory → S3) with CloudWatch and SNS failure alerting. Worked with Data Architects and Data Scientists to deliver production climate risk models; defined team engineering standards and data product frameworks; mentored junior engineers.</w:t>
       </w:r>
     </w:p>
     <w:p>
@@ -503,7 +516,7 @@
           <w:b w:val="0"/>
           <w:sz w:val="21"/>
         </w:rPr>
-        <w:t>Engineered enterprise batch pipelines in Python, SQL, Snowflake, PySpark and StreamSets for the Retail Data &amp; Analytics Decisioning team.</w:t>
+        <w:t>Engineered enterprise batch pipelines in Python, SQL, Snowflake, PySpark and StreamSets for the Retail Data &amp; Analytics Decisioning team, including PySpark pipelines for Customer Lifetime Value (CLV) analytics on high-volume customer data.</w:t>
       </w:r>
     </w:p>
     <w:p>

</xml_diff>

<commit_message>
content: sync site and CV downloads to master CV, add Work With Me page
Rebuild on-site CV from cv_master, ship docx/pdf/txt downloads, add /work-with-me
(day rate, ILR, SC eligibility, notice, services) linked from nav, footer, hero, home.

Co-Authored-By: Claude Sonnet 5.5 <noreply@anthropic.com>
</commit_message>
<xml_diff>
--- a/public/Robin_Saini_CV.docx
+++ b/public/Robin_Saini_CV.docx
@@ -22,16 +22,16 @@
       <w:r>
         <w:rPr>
           <w:b/>
-          <w:sz w:val="21"/>
+          <w:sz w:val="20"/>
         </w:rPr>
         <w:t>Lead / Senior Data Engineer</w:t>
       </w:r>
       <w:r>
         <w:rPr>
           <w:b w:val="0"/>
-          <w:sz w:val="21"/>
+          <w:sz w:val="20"/>
         </w:rPr>
-        <w:t xml:space="preserve"> | Python | PySpark | Airflow | Snowflake | SQL | AI-assisted engineering</w:t>
+        <w:t xml:space="preserve"> | Snowflake | Python &amp; SQL | Spark | Airflow &amp; dbt | Agentic AI Data Engineering</w:t>
       </w:r>
     </w:p>
     <w:p>
@@ -42,9 +42,22 @@
       <w:r>
         <w:rPr>
           <w:b w:val="0"/>
-          <w:sz w:val="21"/>
+          <w:sz w:val="20"/>
         </w:rPr>
         <w:t>London, UK | robinsaini156@gmail.com | +44 7466 201865 | linkedin.com/in/robinsaini | github.com/cloudcruncher</w:t>
+      </w:r>
+    </w:p>
+    <w:p>
+      <w:pPr>
+        <w:spacing w:after="60"/>
+        <w:jc w:val="center"/>
+      </w:pPr>
+      <w:r>
+        <w:rPr>
+          <w:b w:val="0"/>
+          <w:sz w:val="20"/>
+        </w:rPr>
+        <w:t>Right to work in the UK (ILR) | Eligible for SC clearance | Notice period: 12 weeks</w:t>
       </w:r>
     </w:p>
     <w:p>
@@ -69,9 +82,9 @@
       <w:r>
         <w:rPr>
           <w:b w:val="0"/>
-          <w:sz w:val="21"/>
+          <w:sz w:val="20"/>
         </w:rPr>
-        <w:t>Lead / Senior Data Engineer with 15+ years in software and data engineering (10+ in data engineering), delivering data engineering modernisation and transformation in regulated UK financial services. Hands-on every day in Python, PySpark, SQL and Airflow, with engineering standards, CI/CD and automated testing built into delivery. Led the team that built a large-scale Snowflake ESG data platform (50+ sources, 1TB+ monthly), cut batch processing times by 40% through PySpark and DBT optimisation, and earlier worked on Teradata modernisation and a Google Cloud (BigQuery) proof of concept on the Lloyds Banking Group enterprise data platform. Currently lead the data engineering function for all agentic AI projects in an enterprise innovation team, taking work from proof of concept to production, and use AI coding assistants (Kiro CLI at work; Claude Code and Google Antigravity on personal projects) extensively in day-to-day engineering. Defined team engineering standards and mentored junior engineers. A contractor who delivers quickly and works with architects, data scientists, platform teams and business stakeholders.</w:t>
+        <w:t>Lead / Senior Data Engineer with 15+ years in software and data engineering (10+ in data engineering), all in regulated UK banking. Currently lead data engineering for all agentic AI products in NatWest's enterprise innovation team, taking them from proof of concept to production: over 90% less manual case-handling time and quality checks on 300+ commercial onboarding applications a day. Previously led the team that built a 50+ source, 1TB+/month Snowflake ESG and climate data platform. Hands-on every day in Python, SQL, PySpark, Airflow and dbt, with CI/CD, automated testing and data-quality controls built into delivery. Open to permanent lead roles and contract engagements.</w:t>
       </w:r>
     </w:p>
     <w:p>
@@ -97,16 +110,16 @@
       <w:r>
         <w:rPr>
           <w:b/>
-          <w:sz w:val="21"/>
+          <w:sz w:val="20"/>
         </w:rPr>
         <w:t>Data Engineering:</w:t>
       </w:r>
       <w:r>
         <w:rPr>
           <w:b w:val="0"/>
-          <w:sz w:val="21"/>
+          <w:sz w:val="20"/>
         </w:rPr>
-        <w:t xml:space="preserve"> Python (advanced), PySpark / Apache Spark (incl. AWS EMR Serverless), Apache Airflow, SQL (expert), DBT, StreamSets, batch ELT/ETL at scale</w:t>
+        <w:t xml:space="preserve"> Python (advanced), SQL (expert), PySpark / Apache Spark (incl. AWS EMR Serverless), Apache Airflow (AWS MWAA), dbt, StreamSets, batch ELT/ETL at scale</w:t>
       </w:r>
     </w:p>
     <w:p>
@@ -117,16 +130,16 @@
       <w:r>
         <w:rPr>
           <w:b/>
-          <w:sz w:val="21"/>
+          <w:sz w:val="20"/>
         </w:rPr>
-        <w:t>Cloud &amp; Engineering Practice:</w:t>
+        <w:t>Data Platforms:</w:t>
       </w:r>
       <w:r>
         <w:rPr>
           <w:b w:val="0"/>
-          <w:sz w:val="21"/>
+          <w:sz w:val="20"/>
         </w:rPr>
-        <w:t xml:space="preserve"> AWS, GitLab CI/CD, Docker, Git, automated testing, Terraform (maintaining configuration)</w:t>
+        <w:t xml:space="preserve"> Snowflake (architecture, clustering, materialised views, performance and cost tuning), PostgreSQL, Teradata, IBM DB2, data lake design, dimensional and analytical modelling</w:t>
       </w:r>
     </w:p>
     <w:p>
@@ -137,16 +150,16 @@
       <w:r>
         <w:rPr>
           <w:b/>
-          <w:sz w:val="21"/>
+          <w:sz w:val="20"/>
         </w:rPr>
-        <w:t>Data Platforms &amp; Modelling:</w:t>
+        <w:t>AI Data Engineering:</w:t>
       </w:r>
       <w:r>
         <w:rPr>
           <w:b w:val="0"/>
-          <w:sz w:val="21"/>
+          <w:sz w:val="20"/>
         </w:rPr>
-        <w:t xml:space="preserve"> Snowflake (architecture, clustering, materialised views, tuning), PostgreSQL, Teradata, IBM DB2, data lake design, analytical modelling</w:t>
+        <w:t xml:space="preserve"> MCP servers and agent tool integration, RAG / retrieval and context pipelines, OpenAI / Agents SDK, LangGraph, Pydantic data contracts, LLM-as-a-judge evaluation, AI observability; AI-assisted engineering (Kiro CLI, Claude Code)</w:t>
       </w:r>
     </w:p>
     <w:p>
@@ -157,16 +170,16 @@
       <w:r>
         <w:rPr>
           <w:b/>
-          <w:sz w:val="21"/>
+          <w:sz w:val="20"/>
         </w:rPr>
-        <w:t>Quality, Governance &amp; Reliability:</w:t>
+        <w:t>Cloud &amp; DevOps:</w:t>
       </w:r>
       <w:r>
         <w:rPr>
           <w:b w:val="0"/>
-          <w:sz w:val="21"/>
+          <w:sz w:val="20"/>
         </w:rPr>
-        <w:t xml:space="preserve"> Data quality gates, data contracts, Pydantic schema validation, audit trails, GDPR-aligned handling, Splunk dashboards, incident management</w:t>
+        <w:t xml:space="preserve"> AWS (S3, Glue, EMR, Athena, SageMaker), GitLab CI/CD, Docker, Git, Splunk; Terraform (maintaining configuration), GCP</w:t>
       </w:r>
     </w:p>
     <w:p>
@@ -177,36 +190,16 @@
       <w:r>
         <w:rPr>
           <w:b/>
-          <w:sz w:val="21"/>
+          <w:sz w:val="20"/>
         </w:rPr>
-        <w:t>AI Data Engineering:</w:t>
+        <w:t>Quality &amp; Leadership:</w:t>
       </w:r>
       <w:r>
         <w:rPr>
           <w:b w:val="0"/>
-          <w:sz w:val="21"/>
+          <w:sz w:val="20"/>
         </w:rPr>
-        <w:t xml:space="preserve"> AI-assisted engineering (Kiro CLI at work; Claude Code and Antigravity personally); agent tool integration via reusable MCP servers; RAG / retrieval and context pipelines; OpenAI / Agents SDK, LangGraph; LLM-as-a-judge evaluation and AI observability</w:t>
-      </w:r>
-    </w:p>
-    <w:p>
-      <w:pPr>
-        <w:pStyle w:val="ListBullet"/>
-        <w:spacing w:after="20"/>
-      </w:pPr>
-      <w:r>
-        <w:rPr>
-          <w:b/>
-          <w:sz w:val="21"/>
-        </w:rPr>
-        <w:t>Leadership &amp; Delivery:</w:t>
-      </w:r>
-      <w:r>
-        <w:rPr>
-          <w:b w:val="0"/>
-          <w:sz w:val="21"/>
-        </w:rPr>
-        <w:t xml:space="preserve"> Team leadership, mentoring, engineering standards, data product frameworks, stakeholder communication, Agile</w:t>
+        <w:t xml:space="preserve"> data quality gates, audit trails, GDPR-aligned handling, automated testing, incident management; team leadership (up to 5 engineers), mentoring, engineering standards, stakeholders, Agile</w:t>
       </w:r>
     </w:p>
     <w:p>
@@ -231,10 +224,31 @@
       </w:pPr>
       <w:r>
         <w:rPr>
+          <w:b/>
+          <w:sz w:val="20"/>
+        </w:rPr>
+        <w:t>&gt;90% reduction</w:t>
+      </w:r>
+      <w:r>
+        <w:rPr>
           <w:b w:val="0"/>
-          <w:sz w:val="21"/>
+          <w:sz w:val="20"/>
         </w:rPr>
-        <w:t>Agentic AI delivery (current NatWest innovation team): built the data engineering behind DAVE and the model-evaluation microservice, cutting manual case-handling time by over 90% and supporting quality checks on 300+ commercial onboarding applications a day.</w:t>
+        <w:t xml:space="preserve"> in manual case-handling time through agentic decision-support workflows; AI-assisted due-diligence checks on </w:t>
+      </w:r>
+      <w:r>
+        <w:rPr>
+          <w:b/>
+          <w:sz w:val="20"/>
+        </w:rPr>
+        <w:t>300+ applications a day</w:t>
+      </w:r>
+      <w:r>
+        <w:rPr>
+          <w:b w:val="0"/>
+          <w:sz w:val="20"/>
+        </w:rPr>
+        <w:t>.</w:t>
       </w:r>
     </w:p>
     <w:p>
@@ -244,10 +258,17 @@
       </w:pPr>
       <w:r>
         <w:rPr>
+          <w:b/>
+          <w:sz w:val="20"/>
+        </w:rPr>
+        <w:t>50+ sources, 1TB+ a month</w:t>
+      </w:r>
+      <w:r>
+        <w:rPr>
           <w:b w:val="0"/>
-          <w:sz w:val="21"/>
+          <w:sz w:val="20"/>
         </w:rPr>
-        <w:t>Led the team delivering a 50+ source, 1TB+/month Snowflake ESG and climate data platform (layered DBT, Airflow on AWS MWAA) for analytics and regulatory reporting at NatWest.</w:t>
+        <w:t xml:space="preserve"> on the Snowflake ESG and climate data platform, delivered as team lead.</w:t>
       </w:r>
     </w:p>
     <w:p>
@@ -257,23 +278,59 @@
       </w:pPr>
       <w:r>
         <w:rPr>
-          <w:b w:val="0"/>
-          <w:sz w:val="21"/>
+          <w:b/>
+          <w:sz w:val="20"/>
         </w:rPr>
-        <w:t>40% faster batch processing (PySpark and DBT) and 30% fewer data quality incidents on NatWest data platforms.</w:t>
+        <w:t>40% faster</w:t>
       </w:r>
-    </w:p>
-    <w:p>
-      <w:pPr>
-        <w:pStyle w:val="ListBullet"/>
-        <w:spacing w:after="20"/>
-      </w:pPr>
       <w:r>
         <w:rPr>
           <w:b w:val="0"/>
-          <w:sz w:val="21"/>
+          <w:sz w:val="20"/>
         </w:rPr>
-        <w:t>Earlier (Lloyds Banking Group): Teradata modernisation with a BigQuery proof of concept; 50% lower ETL load times and 45% fewer data errors on the enterprise data warehouse.</w:t>
+        <w:t xml:space="preserve"> batches, </w:t>
+      </w:r>
+      <w:r>
+        <w:rPr>
+          <w:b/>
+          <w:sz w:val="20"/>
+        </w:rPr>
+        <w:t>30% fewer</w:t>
+      </w:r>
+      <w:r>
+        <w:rPr>
+          <w:b w:val="0"/>
+          <w:sz w:val="20"/>
+        </w:rPr>
+        <w:t xml:space="preserve"> data quality incidents (NatWest); </w:t>
+      </w:r>
+      <w:r>
+        <w:rPr>
+          <w:b/>
+          <w:sz w:val="20"/>
+        </w:rPr>
+        <w:t>50% lower</w:t>
+      </w:r>
+      <w:r>
+        <w:rPr>
+          <w:b w:val="0"/>
+          <w:sz w:val="20"/>
+        </w:rPr>
+        <w:t xml:space="preserve"> ETL load times, </w:t>
+      </w:r>
+      <w:r>
+        <w:rPr>
+          <w:b/>
+          <w:sz w:val="20"/>
+        </w:rPr>
+        <w:t>45% fewer</w:t>
+      </w:r>
+      <w:r>
+        <w:rPr>
+          <w:b w:val="0"/>
+          <w:sz w:val="20"/>
+        </w:rPr>
+        <w:t xml:space="preserve"> data errors (Lloyds).</w:t>
       </w:r>
     </w:p>
     <w:p>
@@ -310,9 +367,9 @@
       <w:r>
         <w:rPr>
           <w:b w:val="0"/>
-          <w:sz w:val="21"/>
+          <w:sz w:val="20"/>
         </w:rPr>
-        <w:t>Lead the data engineering function across the enterprise innovation team's agentic AI products — DAVE (Decision Assist for complaints), the LLM-as-a-judge evaluation microservice, and the Colleague Assist / CAI contact-centre programme — taking work from proof of concept to production.</w:t>
+        <w:t>Lead the data engineering function for all agentic AI products in the enterprise innovation team, from proof of concept to production, including a complaints decision-assist product, an LLM-as-a-judge evaluation service and a contact-centre assist programme.</w:t>
       </w:r>
     </w:p>
     <w:p>
@@ -323,9 +380,9 @@
       <w:r>
         <w:rPr>
           <w:b w:val="0"/>
-          <w:sz w:val="21"/>
+          <w:sz w:val="20"/>
         </w:rPr>
-        <w:t>Introduced Snowflake CI/CD and automated CI testing for data loaders; built a resilient microservice Snowflake writer with jittered back-off, reducing deployment issues to near zero.</w:t>
+        <w:t>Built the data engineering behind decision-support workflows that cut manual case-handling time by over 90%, and an AI-assisted due-diligence capability supporting quality checks on 300+ commercial onboarding applications a day.</w:t>
       </w:r>
     </w:p>
     <w:p>
@@ -336,9 +393,9 @@
       <w:r>
         <w:rPr>
           <w:b w:val="0"/>
-          <w:sz w:val="21"/>
+          <w:sz w:val="20"/>
         </w:rPr>
-        <w:t>Orchestrate workflows with Airflow across enterprise microservices, Snowflake, PostgreSQL and PCF; built a near-real-time Kafka → LLM-as-a-judge evaluation pipeline (with batch REST path) scoring model decisions and writing metrics to Snowflake, and Splunk observability for agent execution, tool-call performance and decision quality.</w:t>
+        <w:t>Designed a reusable, PII-guardrailed MCP server (bounded JSON slices, role-based field allow-lists, full audit trail) that multiple agents consume with no data-access code, standardising access to core banking, CRM and case-management systems.</w:t>
       </w:r>
     </w:p>
     <w:p>
@@ -349,9 +406,9 @@
       <w:r>
         <w:rPr>
           <w:b w:val="0"/>
-          <w:sz w:val="21"/>
+          <w:sz w:val="20"/>
         </w:rPr>
-        <w:t>Built PySpark pipelines on AWS EMR Serverless for model monitoring: extract model inputs and outputs from PostgreSQL and on-prem sources to S3 (Parquet) and Snowflake, computing operational and ML performance metrics (accuracy, precision, recall, F1) plus LLM token-usage and latency tracking, orchestrated by Airflow.</w:t>
+        <w:t>Built RAG / retrieval and context pipelines; debugged retrieval quality at source (segment filtering, candidate-pool sizing, confidence thresholding), materially improving relevant-result recall. Cut agent data-hydration latency with warmed persistent sessions and response caching.</w:t>
       </w:r>
     </w:p>
     <w:p>
@@ -362,9 +419,9 @@
       <w:r>
         <w:rPr>
           <w:b w:val="0"/>
-          <w:sz w:val="21"/>
+          <w:sz w:val="20"/>
         </w:rPr>
-        <w:t>Designed data contracts, Pydantic schema validation, quality gates and audit trails so agent inputs meet banking and financial-crime compliance standards.</w:t>
+        <w:t>Built an LLM-as-a-judge evaluation pipeline (with a batch REST path) scoring model decisions into Snowflake, and PySpark pipelines on AWS EMR Serverless for model monitoring (accuracy, precision, recall, F1, LLM token usage and latency), orchestrated in Airflow.</w:t>
       </w:r>
     </w:p>
     <w:p>
@@ -375,9 +432,9 @@
       <w:r>
         <w:rPr>
           <w:b w:val="0"/>
-          <w:sz w:val="21"/>
+          <w:sz w:val="20"/>
         </w:rPr>
-        <w:t>Built the data engineering behind DAVE's decision-support workflows (decision-outcome, compensation and fix-classification prediction, plus a graph-following fix-resolution agent) that cut manual case-handling time by over 90%, and an AI-assisted due-diligence capability supporting quality checks on 300+ commercial onboarding applications a day.</w:t>
+        <w:t>Introduced Snowflake CI/CD and automated testing for data loaders; built a resilient Snowflake writer with jittered back-off, reducing deployment issues to near zero.</w:t>
       </w:r>
     </w:p>
     <w:p>
@@ -388,9 +445,20 @@
       <w:r>
         <w:rPr>
           <w:b w:val="0"/>
-          <w:sz w:val="21"/>
+          <w:sz w:val="20"/>
         </w:rPr>
-        <w:t>Designed and packaged a reusable, PII-guardrailed MCP server (bounded JSON slices, role-based field allow-lists, full audit trail) consumed by multiple downstream agents with no data-access code — reused end-to-end by DAVE — standardising agent access to enterprise systems and cutting integration effort.</w:t>
+        <w:t>Designed data contracts, Pydantic validation, quality gates and audit trails to meet banking and financial-crime compliance standards; built Splunk observability for agent execution and decision quality. Deliver via GitLab CI/CD and Docker.</w:t>
+      </w:r>
+    </w:p>
+    <w:p>
+      <w:pPr>
+        <w:spacing w:before="120" w:after="0"/>
+      </w:pPr>
+      <w:r>
+        <w:rPr>
+          <w:b/>
+        </w:rPr>
+        <w:t>NatWest Group, Edinburgh | Senior Data Engineer - Climate Analytics (ESG Data Platform) | Jul 2023 - Aug 2025</w:t>
       </w:r>
     </w:p>
     <w:p>
@@ -401,9 +469,9 @@
       <w:r>
         <w:rPr>
           <w:b w:val="0"/>
-          <w:sz w:val="21"/>
+          <w:sz w:val="20"/>
         </w:rPr>
-        <w:t>Built RAG / retrieval and context pipelines, debugging retrieval quality at source and materially improving relevant-result recall; cut agent data-hydration latency with warmed persistent sessions and response caching.</w:t>
+        <w:t>Led a team of Data Engineers delivering NatWest's ESG and climate data platform on Snowflake: 50+ internal and external sources, 1TB+ a month, for analytics and regulatory reporting. Layered dbt project (RAW, INT, PRS, presentation) orchestrated by Airflow on AWS MWAA.</w:t>
       </w:r>
     </w:p>
     <w:p>
@@ -414,9 +482,9 @@
       <w:r>
         <w:rPr>
           <w:b w:val="0"/>
-          <w:sz w:val="21"/>
+          <w:sz w:val="20"/>
         </w:rPr>
-        <w:t>Use AI coding assistants (Kiro CLI at work; Claude Code and Google Antigravity on personal projects) extensively in day-to-day engineering work.</w:t>
+        <w:t>Cut batch processing times by 40% through PySpark and dbt optimisation.</w:t>
       </w:r>
     </w:p>
     <w:p>
@@ -427,9 +495,22 @@
       <w:r>
         <w:rPr>
           <w:b w:val="0"/>
-          <w:sz w:val="21"/>
+          <w:sz w:val="20"/>
         </w:rPr>
-        <w:t>On the Colleague Assist / CAI contact-centre work, engineered Snowflake data models over AWS Connect call transcripts and contact-trace records (turn-timing and silence analytics) for the Data Science team. Work with business stakeholders from discovery onwards; partner with ML Engineering, Data Science and Platform teams; deliver via GitLab CI/CD and Docker.</w:t>
+        <w:t>Reduced data quality incidents by 30% with metadata-driven ingestion (new sources by config, not code), idempotent re-run guards, dbt snapshots and automated dbt tests; cut Snowflake compute cost with per-model warehouse routing and transient tables.</w:t>
+      </w:r>
+    </w:p>
+    <w:p>
+      <w:pPr>
+        <w:pStyle w:val="ListBullet"/>
+        <w:spacing w:after="20"/>
+      </w:pPr>
+      <w:r>
+        <w:rPr>
+          <w:b w:val="0"/>
+          <w:sz w:val="20"/>
+        </w:rPr>
+        <w:t>Delivered production climate risk models with Data Architects and Data Scientists; defined engineering standards and data product frameworks; mentored junior engineers.</w:t>
       </w:r>
     </w:p>
     <w:p>
@@ -440,7 +521,7 @@
         <w:rPr>
           <w:b/>
         </w:rPr>
-        <w:t>NatWest Group | Senior Data Engineer - Climate Analytics (ESG Data Platform) | Jul 2023 - Aug 2025</w:t>
+        <w:t>NatWest Group, Edinburgh | Senior Data Engineer - Retail Analytics | Sep 2021 - Jul 2023</w:t>
       </w:r>
     </w:p>
     <w:p>
@@ -451,9 +532,9 @@
       <w:r>
         <w:rPr>
           <w:b w:val="0"/>
-          <w:sz w:val="21"/>
+          <w:sz w:val="20"/>
         </w:rPr>
-        <w:t>Led a team of Data Engineers delivering NatWest's ESG and climate data platform on Snowflake: 50+ internal and external sources, 1TB+ processed monthly, for analytics and regulatory reporting. Built it as a layered DBT project (RAW → INT → PRS → presentation) orchestrated by Airflow on AWS MWAA.</w:t>
+        <w:t>Engineered enterprise batch pipelines in Python, SQL, Snowflake, PySpark and StreamSets for the Retail Data &amp; Analytics Decisioning team, including PySpark pipelines for Customer Lifetime Value analytics.</w:t>
       </w:r>
     </w:p>
     <w:p>
@@ -464,9 +545,20 @@
       <w:r>
         <w:rPr>
           <w:b w:val="0"/>
-          <w:sz w:val="21"/>
+          <w:sz w:val="20"/>
         </w:rPr>
-        <w:t>Cut batch processing times by 40% through PySpark and DBT optimisation.</w:t>
+        <w:t>Designed Snowflake data models for high-volume analytical workloads, tuned with clustering, partitioning and materialised views.</w:t>
+      </w:r>
+    </w:p>
+    <w:p>
+      <w:pPr>
+        <w:spacing w:before="120" w:after="0"/>
+      </w:pPr>
+      <w:r>
+        <w:rPr>
+          <w:b/>
+        </w:rPr>
+        <w:t>Tata Consultancy Services (client: Lloyds Banking Group), Manchester &amp; Gurugram | Data Engineer - Enterprise Data Platform | Jun 2019 - Sep 2021</w:t>
       </w:r>
     </w:p>
     <w:p>
@@ -477,9 +569,9 @@
       <w:r>
         <w:rPr>
           <w:b w:val="0"/>
-          <w:sz w:val="21"/>
+          <w:sz w:val="20"/>
         </w:rPr>
-        <w:t>Reduced data quality incidents by 30% with metadata-driven ingestion (new sources onboarded by config, not code), idempotent duplicate-load guards for safe re-runs, DBT snapshots for full change history, and automated DBT tests.</w:t>
+        <w:t>Led a 5-member Data Services team running the Lloyds enterprise data platform: Teradata warehouse, reporting applications and data support for analytics teams.</w:t>
       </w:r>
     </w:p>
     <w:p>
@@ -490,9 +582,22 @@
       <w:r>
         <w:rPr>
           <w:b w:val="0"/>
-          <w:sz w:val="21"/>
+          <w:sz w:val="20"/>
         </w:rPr>
-        <w:t>Cut Snowflake compute cost with per-model warehouse routing and transient tables, and automated deployment of the DBT project to MWAA via a build-and-promote pipeline (Artifactory → S3) with CloudWatch and SNS failure alerting. Worked with Data Architects and Data Scientists to deliver production climate risk models; defined team engineering standards and data product frameworks; mentored junior engineers.</w:t>
+        <w:t>Designed and delivered an ML-ready data lake on AWS for data science programmes; supported the IBM DB2 operational data store; ran a Google BigQuery proof of concept for Teradata modernisation.</w:t>
+      </w:r>
+    </w:p>
+    <w:p>
+      <w:pPr>
+        <w:pStyle w:val="ListBullet"/>
+        <w:spacing w:after="20"/>
+      </w:pPr>
+      <w:r>
+        <w:rPr>
+          <w:b w:val="0"/>
+          <w:sz w:val="20"/>
+        </w:rPr>
+        <w:t>Tuned SQL and batch applications to cut CPU consumption; led Teradata upgrades and disaster recovery; gave 24/7 support for business-critical, regulatory and legal applications and resolved a critical production incident in under 12 hours.</w:t>
       </w:r>
     </w:p>
     <w:p>
@@ -503,7 +608,7 @@
         <w:rPr>
           <w:b/>
         </w:rPr>
-        <w:t>NatWest Group | Senior Data Engineer - Retail Analytics | Sep 2021 - Jul 2023</w:t>
+        <w:t>Tata Consultancy Services (client: Lloyds Banking Group) | Enterprise Data Warehouse Engineer | Feb 2016 - May 2019</w:t>
       </w:r>
     </w:p>
     <w:p>
@@ -514,9 +619,20 @@
       <w:r>
         <w:rPr>
           <w:b w:val="0"/>
-          <w:sz w:val="21"/>
+          <w:sz w:val="20"/>
         </w:rPr>
-        <w:t>Engineered enterprise batch pipelines in Python, SQL, Snowflake, PySpark and StreamSets for the Retail Data &amp; Analytics Decisioning team, including PySpark pipelines for Customer Lifetime Value (CLV) analytics on high-volume customer data.</w:t>
+        <w:t>Built ETL pipelines that cut data load times by 50%; implemented a GDPR-compliant data governance framework that reduced data errors by 45%.</w:t>
+      </w:r>
+    </w:p>
+    <w:p>
+      <w:pPr>
+        <w:spacing w:before="120" w:after="0"/>
+      </w:pPr>
+      <w:r>
+        <w:rPr>
+          <w:b/>
+        </w:rPr>
+        <w:t>UST Global, Gurugram | Senior Software Engineer (Mainframe) | Apr 2015 - Feb 2016</w:t>
       </w:r>
     </w:p>
     <w:p>
@@ -527,9 +643,9 @@
       <w:r>
         <w:rPr>
           <w:b w:val="0"/>
-          <w:sz w:val="21"/>
+          <w:sz w:val="20"/>
         </w:rPr>
-        <w:t>Designed Snowflake data models for high-volume analytical workloads; tuned with clustering, partitioning and materialised views.</w:t>
+        <w:t>Built and supported COBOL / DB2 mainframe applications under ITIL incident, problem and change management; contributed to high-level designs with business analysts and mentored junior team members.</w:t>
       </w:r>
     </w:p>
     <w:p>
@@ -540,7 +656,7 @@
         <w:rPr>
           <w:b/>
         </w:rPr>
-        <w:t>Tata Consultancy Services (Lloyds Banking Group) | Data Engineer - Enterprise Data Platform | Jun 2019 - Sep 2021</w:t>
+        <w:t>Sopra Steria, Noida | Software Engineer (Mainframe) | Apr 2011 - Mar 2015</w:t>
       </w:r>
     </w:p>
     <w:p>
@@ -551,135 +667,9 @@
       <w:r>
         <w:rPr>
           <w:b w:val="0"/>
-          <w:sz w:val="21"/>
+          <w:sz w:val="20"/>
         </w:rPr>
-        <w:t>Part of the enterprise data platform team, mainly on Teradata modernisation, and explored a move to Google BigQuery through a proof of concept on Google Cloud Platform.</w:t>
-      </w:r>
-    </w:p>
-    <w:p>
-      <w:pPr>
-        <w:pStyle w:val="ListBullet"/>
-        <w:spacing w:after="20"/>
-      </w:pPr>
-      <w:r>
-        <w:rPr>
-          <w:b w:val="0"/>
-          <w:sz w:val="21"/>
-        </w:rPr>
-        <w:t>Led a 5-member Data Services team running the Lloyds enterprise data platform: Teradata warehouse, reporting applications, data support for analytics teams.</w:t>
-      </w:r>
-    </w:p>
-    <w:p>
-      <w:pPr>
-        <w:pStyle w:val="ListBullet"/>
-        <w:spacing w:after="20"/>
-      </w:pPr>
-      <w:r>
-        <w:rPr>
-          <w:b w:val="0"/>
-          <w:sz w:val="21"/>
-        </w:rPr>
-        <w:t>Gathered requirements for migrating on-premise applications to the cloud.</w:t>
-      </w:r>
-    </w:p>
-    <w:p>
-      <w:pPr>
-        <w:pStyle w:val="ListBullet"/>
-        <w:spacing w:after="20"/>
-      </w:pPr>
-      <w:r>
-        <w:rPr>
-          <w:b w:val="0"/>
-          <w:sz w:val="21"/>
-        </w:rPr>
-        <w:t>Supported the IBM DB2 operational data store (source extraction, curation and ingestion); tuned SQL queries and batch applications to cut CPU consumption.</w:t>
-      </w:r>
-    </w:p>
-    <w:p>
-      <w:pPr>
-        <w:pStyle w:val="ListBullet"/>
-        <w:spacing w:after="20"/>
-      </w:pPr>
-      <w:r>
-        <w:rPr>
-          <w:b w:val="0"/>
-          <w:sz w:val="21"/>
-        </w:rPr>
-        <w:t>Led Teradata upgrades and disaster-recovery events; 24/7 support for business-critical, regulatory and legal applications; resolved a critical production incident in under 12 hours.</w:t>
-      </w:r>
-    </w:p>
-    <w:p>
-      <w:pPr>
-        <w:spacing w:before="120" w:after="0"/>
-      </w:pPr>
-      <w:r>
-        <w:rPr>
-          <w:b/>
-        </w:rPr>
-        <w:t>Tata Consultancy Services (Lloyds Banking Group) | Enterprise Data Warehouse Engineer | Feb 2016 - May 2019</w:t>
-      </w:r>
-    </w:p>
-    <w:p>
-      <w:pPr>
-        <w:pStyle w:val="ListBullet"/>
-        <w:spacing w:after="20"/>
-      </w:pPr>
-      <w:r>
-        <w:rPr>
-          <w:b w:val="0"/>
-          <w:sz w:val="21"/>
-        </w:rPr>
-        <w:t>Built scalable ETL pipelines that cut data load times by 50%.</w:t>
-      </w:r>
-    </w:p>
-    <w:p>
-      <w:pPr>
-        <w:pStyle w:val="ListBullet"/>
-        <w:spacing w:after="20"/>
-      </w:pPr>
-      <w:r>
-        <w:rPr>
-          <w:b w:val="0"/>
-          <w:sz w:val="21"/>
-        </w:rPr>
-        <w:t>Implemented a GDPR-compliant data governance framework that reduced data errors by 45%.</w:t>
-      </w:r>
-    </w:p>
-    <w:p>
-      <w:pPr>
-        <w:pStyle w:val="ListBullet"/>
-        <w:spacing w:after="20"/>
-      </w:pPr>
-      <w:r>
-        <w:rPr>
-          <w:b w:val="0"/>
-          <w:sz w:val="21"/>
-        </w:rPr>
-        <w:t>Built and maintained SQL macros so business teams without SQL knowledge could self-serve data.</w:t>
-      </w:r>
-    </w:p>
-    <w:p>
-      <w:pPr>
-        <w:spacing w:before="120" w:after="0"/>
-      </w:pPr>
-      <w:r>
-        <w:rPr>
-          <w:b/>
-        </w:rPr>
-        <w:t>UST Global &amp; Sopra Steria | Mainframe Software Engineer - COBOL / DB2 | 2011 - 2016</w:t>
-      </w:r>
-    </w:p>
-    <w:p>
-      <w:pPr>
-        <w:pStyle w:val="ListBullet"/>
-        <w:spacing w:after="20"/>
-      </w:pPr>
-      <w:r>
-        <w:rPr>
-          <w:b w:val="0"/>
-          <w:sz w:val="21"/>
-        </w:rPr>
-        <w:t>Built and supported COBOL / DB2 mainframe systems, including for a UK retailer, under ITIL incident, problem and change management.</w:t>
+        <w:t>Trained in mainframe technology, then built and supported COBOL / DB2 systems for a UK retailer; prepared detailed designs from business requirements under ITIL processes.</w:t>
       </w:r>
     </w:p>
     <w:p>
@@ -694,7 +684,7 @@
           <w:b/>
           <w:sz w:val="23"/>
         </w:rPr>
-        <w:t>CERTIFICATIONS &amp; EDUCATION</w:t>
+        <w:t>EDUCATION &amp; CERTIFICATIONS</w:t>
       </w:r>
     </w:p>
     <w:p>
@@ -705,9 +695,9 @@
       <w:r>
         <w:rPr>
           <w:b w:val="0"/>
-          <w:sz w:val="21"/>
+          <w:sz w:val="20"/>
         </w:rPr>
-        <w:t>Big Data on AWS, Amazon Web Services (May 2022) | Data Engineering Nanodegree, Udacity (May 2022) | Google Cloud Engineering Specialization, Coursera</w:t>
+        <w:t>B.Tech, Computer Science, Gautam Buddh Technical University, India (2006 - 2010)</w:t>
       </w:r>
     </w:p>
     <w:p>
@@ -718,14 +708,14 @@
       <w:r>
         <w:rPr>
           <w:b w:val="0"/>
-          <w:sz w:val="21"/>
+          <w:sz w:val="20"/>
         </w:rPr>
-        <w:t>B.Tech, Computer Science, Dr. A.P.J. Abdul Kalam Technical University, India (2006 - 2010)</w:t>
+        <w:t>Big Data on AWS, Amazon Web Services (May 2022) | Data Engineering Nanodegree, Udacity (May 2022) | Google Cloud Engineering Specialization, Coursera</w:t>
       </w:r>
     </w:p>
     <w:sectPr>
       <w:pgSz w:w="12240" w:h="15840"/>
-      <w:pgMar w:top="907" w:right="1020" w:bottom="907" w:left="1020" w:header="720" w:footer="720" w:gutter="0"/>
+      <w:pgMar w:top="737" w:right="907" w:bottom="737" w:left="907" w:header="720" w:footer="720" w:gutter="0"/>
       <w:cols w:space="720"/>
       <w:docGrid w:linePitch="360"/>
     </w:sectPr>

</xml_diff>

<commit_message>
feat: animated data-engineer redesign, architecture section, sync to master CV
Hero gets an animated data-to-agent pipeline and agent-run log; new
reference-architecture tabs and skills-by-depth section. Content synced
to the verified job-harness CV: 8+ years data engineering, no notice
period, and removed unverified claims (led teams, 45%/50% metrics,
BigQuery, Data Guardian, data marketplace). Respects reduced motion and
adds a pause control.

Co-Authored-By: Claude Sonnet 5.5 <noreply@anthropic.com>
</commit_message>
<xml_diff>
--- a/public/Robin_Saini_CV.docx
+++ b/public/Robin_Saini_CV.docx
@@ -21,17 +21,10 @@
       </w:pPr>
       <w:r>
         <w:rPr>
-          <w:b/>
-          <w:sz w:val="20"/>
+          <w:b w:val="0"/>
+          <w:sz w:val="21"/>
         </w:rPr>
-        <w:t>Lead / Senior Data Engineer</w:t>
-      </w:r>
-      <w:r>
-        <w:rPr>
-          <w:b w:val="0"/>
-          <w:sz w:val="20"/>
-        </w:rPr>
-        <w:t xml:space="preserve"> | Snowflake | Python &amp; SQL | Spark | Airflow &amp; dbt | Agentic AI Data Engineering</w:t>
+        <w:t>Lead / Principal Data Engineer | Snowflake Data Platforms &amp; Agentic AI | Python &amp; SQL | PySpark | Airflow &amp; dbt</w:t>
       </w:r>
     </w:p>
     <w:p>
@@ -42,7 +35,7 @@
       <w:r>
         <w:rPr>
           <w:b w:val="0"/>
-          <w:sz w:val="20"/>
+          <w:sz w:val="21"/>
         </w:rPr>
         <w:t>London, UK | robinsaini156@gmail.com | +44 7466 201865 | linkedin.com/in/robinsaini | github.com/cloudcruncher</w:t>
       </w:r>
@@ -55,9 +48,9 @@
       <w:r>
         <w:rPr>
           <w:b w:val="0"/>
-          <w:sz w:val="20"/>
+          <w:sz w:val="21"/>
         </w:rPr>
-        <w:t>Right to work in the UK (ILR) | Eligible for SC clearance | Notice period: 12 weeks</w:t>
+        <w:t>Right to work in the UK (ILR) | Eligible for SC clearance</w:t>
       </w:r>
     </w:p>
     <w:p>
@@ -82,9 +75,69 @@
       <w:r>
         <w:rPr>
           <w:b w:val="0"/>
-          <w:sz w:val="20"/>
+          <w:sz w:val="21"/>
         </w:rPr>
-        <w:t>Lead / Senior Data Engineer with 15+ years in software and data engineering (10+ in data engineering), all in regulated UK banking. Currently lead data engineering for all agentic AI products in NatWest's enterprise innovation team, taking them from proof of concept to production: over 90% less manual case-handling time and quality checks on 300+ commercial onboarding applications a day. Previously led the team that built a 50+ source, 1TB+/month Snowflake ESG and climate data platform. Hands-on every day in Python, SQL, PySpark, Airflow and dbt, with CI/CD, automated testing and data-quality controls built into delivery. Open to permanent lead roles and contract engagements.</w:t>
+        <w:t>Lead data engineer in regulated UK banking: 15+ years in software and data engineering, 8+ in data engineering. Hands-on in Python, SQL, Snowflake, PySpark, Airflow and dbt.</w:t>
+      </w:r>
+    </w:p>
+    <w:p>
+      <w:pPr>
+        <w:pStyle w:val="ListBullet"/>
+        <w:spacing w:after="20"/>
+      </w:pPr>
+      <w:r>
+        <w:rPr>
+          <w:b/>
+          <w:sz w:val="21"/>
+        </w:rPr>
+        <w:t>Now:</w:t>
+      </w:r>
+      <w:r>
+        <w:rPr>
+          <w:b w:val="0"/>
+          <w:sz w:val="21"/>
+        </w:rPr>
+        <w:t xml:space="preserve"> lead data engineer for NatWest's enterprise innovation team, taking agentic AI products from proof of concept to production: a complaints investigation agent checked by LLM-as-a-judge evaluations, a GenAI customer due diligence pipeline and a reusable MCP data-access layer.</w:t>
+      </w:r>
+    </w:p>
+    <w:p>
+      <w:pPr>
+        <w:pStyle w:val="ListBullet"/>
+        <w:spacing w:after="20"/>
+      </w:pPr>
+      <w:r>
+        <w:rPr>
+          <w:b/>
+          <w:sz w:val="21"/>
+        </w:rPr>
+        <w:t>Before:</w:t>
+      </w:r>
+      <w:r>
+        <w:rPr>
+          <w:b w:val="0"/>
+          <w:sz w:val="21"/>
+        </w:rPr>
+        <w:t xml:space="preserve"> core engineer on a 50+ source, 1TB+/month Snowflake and dbt ESG and climate data platform whose EPC score data product is shown to customers in the NatWest app; Snowflake and PySpark analytics for Retail Decisioning; Teradata and DB2 data warehousing for Lloyds Banking Group (via TCS).</w:t>
+      </w:r>
+    </w:p>
+    <w:p>
+      <w:pPr>
+        <w:pStyle w:val="ListBullet"/>
+        <w:spacing w:after="20"/>
+      </w:pPr>
+      <w:r>
+        <w:rPr>
+          <w:b/>
+          <w:sz w:val="21"/>
+        </w:rPr>
+        <w:t>How I work:</w:t>
+      </w:r>
+      <w:r>
+        <w:rPr>
+          <w:b w:val="0"/>
+          <w:sz w:val="21"/>
+        </w:rPr>
+        <w:t xml:space="preserve"> hands-on individual contributor; mentoring junior engineers and setting engineering standards is part of the job.</w:t>
       </w:r>
     </w:p>
     <w:p>
@@ -109,17 +162,10 @@
       </w:pPr>
       <w:r>
         <w:rPr>
-          <w:b/>
-          <w:sz w:val="20"/>
+          <w:b w:val="0"/>
+          <w:sz w:val="21"/>
         </w:rPr>
-        <w:t>Data Engineering:</w:t>
-      </w:r>
-      <w:r>
-        <w:rPr>
-          <w:b w:val="0"/>
-          <w:sz w:val="20"/>
-        </w:rPr>
-        <w:t xml:space="preserve"> Python (advanced), SQL (expert), PySpark / Apache Spark (incl. AWS EMR Serverless), Apache Airflow (AWS MWAA), dbt, StreamSets, batch ELT/ETL at scale</w:t>
+        <w:t>Data Engineering: Python (advanced), SQL (expert), PySpark / Apache Spark (incl. AWS EMR Serverless), Apache Airflow (AWS MWAA), dbt, StreamSets, batch ELT/ETL at scale</w:t>
       </w:r>
     </w:p>
     <w:p>
@@ -129,17 +175,10 @@
       </w:pPr>
       <w:r>
         <w:rPr>
-          <w:b/>
-          <w:sz w:val="20"/>
+          <w:b w:val="0"/>
+          <w:sz w:val="21"/>
         </w:rPr>
-        <w:t>Data Platforms:</w:t>
-      </w:r>
-      <w:r>
-        <w:rPr>
-          <w:b w:val="0"/>
-          <w:sz w:val="20"/>
-        </w:rPr>
-        <w:t xml:space="preserve"> Snowflake (architecture, clustering, materialised views, performance and cost tuning), PostgreSQL, Teradata, IBM DB2, data lake design, dimensional and analytical modelling</w:t>
+        <w:t>Data Platforms: Snowflake (architecture, warehouses, Tasks/Streams, UDFs/stored procedures, Time Travel, cloning, clustering, materialised views, performance and cost tuning), PostgreSQL, Teradata, IBM DB2, data modelling; familiar with Hadoop and Hive</w:t>
       </w:r>
     </w:p>
     <w:p>
@@ -149,17 +188,10 @@
       </w:pPr>
       <w:r>
         <w:rPr>
-          <w:b/>
-          <w:sz w:val="20"/>
+          <w:b w:val="0"/>
+          <w:sz w:val="21"/>
         </w:rPr>
-        <w:t>AI Data Engineering:</w:t>
-      </w:r>
-      <w:r>
-        <w:rPr>
-          <w:b w:val="0"/>
-          <w:sz w:val="20"/>
-        </w:rPr>
-        <w:t xml:space="preserve"> MCP servers and agent tool integration, RAG / retrieval and context pipelines, OpenAI / Agents SDK, LangGraph, Pydantic data contracts, LLM-as-a-judge evaluation, AI observability; AI-assisted engineering (Kiro CLI, Claude Code)</w:t>
+        <w:t>AI Data Engineering: OpenAI / Agents SDK tool calling, Kafka (consumer, familiar), MCP servers and agent tool integration, RAG / retrieval and context pipelines, LangGraph, Pydantic data contracts, LLM-as-a-judge evaluation, AI observability; AI-assisted engineering (Claude Code, Kiro CLI)</w:t>
       </w:r>
     </w:p>
     <w:p>
@@ -169,17 +201,10 @@
       </w:pPr>
       <w:r>
         <w:rPr>
-          <w:b/>
-          <w:sz w:val="20"/>
+          <w:b w:val="0"/>
+          <w:sz w:val="21"/>
         </w:rPr>
-        <w:t>Cloud &amp; DevOps:</w:t>
-      </w:r>
-      <w:r>
-        <w:rPr>
-          <w:b w:val="0"/>
-          <w:sz w:val="20"/>
-        </w:rPr>
-        <w:t xml:space="preserve"> AWS (S3, Glue, EMR, Athena, SageMaker), GitLab CI/CD, Docker, Git, Splunk; Terraform (maintaining configuration), GCP</w:t>
+        <w:t>Cloud &amp; DevOps: AWS (S3, Glue, EMR, Athena, SageMaker), GitLab CI/CD, Docker, Git, Splunk; familiar with Terraform (maintains configuration in team repos)</w:t>
       </w:r>
     </w:p>
     <w:p>
@@ -189,148 +214,10 @@
       </w:pPr>
       <w:r>
         <w:rPr>
-          <w:b/>
-          <w:sz w:val="20"/>
+          <w:b w:val="0"/>
+          <w:sz w:val="21"/>
         </w:rPr>
-        <w:t>Quality &amp; Leadership:</w:t>
-      </w:r>
-      <w:r>
-        <w:rPr>
-          <w:b w:val="0"/>
-          <w:sz w:val="20"/>
-        </w:rPr>
-        <w:t xml:space="preserve"> data quality gates, audit trails, GDPR-aligned handling, automated testing, incident management; team leadership (up to 5 engineers), mentoring, engineering standards, stakeholders, Agile</w:t>
-      </w:r>
-    </w:p>
-    <w:p>
-      <w:pPr>
-        <w:spacing w:before="200" w:after="40"/>
-        <w:pBdr>
-          <w:bottom w:val="single" w:sz="6" w:space="1" w:color="808080"/>
-        </w:pBdr>
-      </w:pPr>
-      <w:r>
-        <w:rPr>
-          <w:b/>
-          <w:sz w:val="23"/>
-        </w:rPr>
-        <w:t>SELECTED IMPACT</w:t>
-      </w:r>
-    </w:p>
-    <w:p>
-      <w:pPr>
-        <w:pStyle w:val="ListBullet"/>
-        <w:spacing w:after="20"/>
-      </w:pPr>
-      <w:r>
-        <w:rPr>
-          <w:b/>
-          <w:sz w:val="20"/>
-        </w:rPr>
-        <w:t>&gt;90% reduction</w:t>
-      </w:r>
-      <w:r>
-        <w:rPr>
-          <w:b w:val="0"/>
-          <w:sz w:val="20"/>
-        </w:rPr>
-        <w:t xml:space="preserve"> in manual case-handling time through agentic decision-support workflows; AI-assisted due-diligence checks on </w:t>
-      </w:r>
-      <w:r>
-        <w:rPr>
-          <w:b/>
-          <w:sz w:val="20"/>
-        </w:rPr>
-        <w:t>300+ applications a day</w:t>
-      </w:r>
-      <w:r>
-        <w:rPr>
-          <w:b w:val="0"/>
-          <w:sz w:val="20"/>
-        </w:rPr>
-        <w:t>.</w:t>
-      </w:r>
-    </w:p>
-    <w:p>
-      <w:pPr>
-        <w:pStyle w:val="ListBullet"/>
-        <w:spacing w:after="20"/>
-      </w:pPr>
-      <w:r>
-        <w:rPr>
-          <w:b/>
-          <w:sz w:val="20"/>
-        </w:rPr>
-        <w:t>50+ sources, 1TB+ a month</w:t>
-      </w:r>
-      <w:r>
-        <w:rPr>
-          <w:b w:val="0"/>
-          <w:sz w:val="20"/>
-        </w:rPr>
-        <w:t xml:space="preserve"> on the Snowflake ESG and climate data platform, delivered as team lead.</w:t>
-      </w:r>
-    </w:p>
-    <w:p>
-      <w:pPr>
-        <w:pStyle w:val="ListBullet"/>
-        <w:spacing w:after="20"/>
-      </w:pPr>
-      <w:r>
-        <w:rPr>
-          <w:b/>
-          <w:sz w:val="20"/>
-        </w:rPr>
-        <w:t>40% faster</w:t>
-      </w:r>
-      <w:r>
-        <w:rPr>
-          <w:b w:val="0"/>
-          <w:sz w:val="20"/>
-        </w:rPr>
-        <w:t xml:space="preserve"> batches, </w:t>
-      </w:r>
-      <w:r>
-        <w:rPr>
-          <w:b/>
-          <w:sz w:val="20"/>
-        </w:rPr>
-        <w:t>30% fewer</w:t>
-      </w:r>
-      <w:r>
-        <w:rPr>
-          <w:b w:val="0"/>
-          <w:sz w:val="20"/>
-        </w:rPr>
-        <w:t xml:space="preserve"> data quality incidents (NatWest); </w:t>
-      </w:r>
-      <w:r>
-        <w:rPr>
-          <w:b/>
-          <w:sz w:val="20"/>
-        </w:rPr>
-        <w:t>50% lower</w:t>
-      </w:r>
-      <w:r>
-        <w:rPr>
-          <w:b w:val="0"/>
-          <w:sz w:val="20"/>
-        </w:rPr>
-        <w:t xml:space="preserve"> ETL load times, </w:t>
-      </w:r>
-      <w:r>
-        <w:rPr>
-          <w:b/>
-          <w:sz w:val="20"/>
-        </w:rPr>
-        <w:t>45% fewer</w:t>
-      </w:r>
-      <w:r>
-        <w:rPr>
-          <w:b w:val="0"/>
-          <w:sz w:val="20"/>
-        </w:rPr>
-        <w:t xml:space="preserve"> data errors (Lloyds).</w:t>
+        <w:t>Quality &amp; Leadership: data quality in regulated environments, data contracts, data quality gates, audit trails and lineage, automated testing, incident management; technical leadership, coaching and mentoring, onshore-offshore delivery, engineering standards, stakeholders from discovery onwards, Agile</w:t>
       </w:r>
     </w:p>
     <w:p>
@@ -356,7 +243,26 @@
         <w:rPr>
           <w:b/>
         </w:rPr>
-        <w:t>NatWest Group, London (Hybrid) | Senior Data Engineer - Agentic Systems &amp; LLM Deployment | Aug 2025 - Present</w:t>
+        <w:t>Senior Data Engineer - Agentic Systems &amp; LLM Deployment</w:t>
+      </w:r>
+    </w:p>
+    <w:p>
+      <w:pPr>
+        <w:spacing w:after="60"/>
+      </w:pPr>
+      <w:r>
+        <w:rPr>
+          <w:b/>
+          <w:sz w:val="21"/>
+        </w:rPr>
+        <w:t>NatWest Group</w:t>
+      </w:r>
+      <w:r>
+        <w:rPr>
+          <w:b w:val="0"/>
+          <w:sz w:val="21"/>
+        </w:rPr>
+        <w:t>, London (Hybrid) | Aug 2025 - Present</w:t>
       </w:r>
     </w:p>
     <w:p>
@@ -367,9 +273,9 @@
       <w:r>
         <w:rPr>
           <w:b w:val="0"/>
-          <w:sz w:val="20"/>
+          <w:sz w:val="21"/>
         </w:rPr>
-        <w:t>Lead the data engineering function for all agentic AI products in the enterprise innovation team, from proof of concept to production, including a complaints decision-assist product, an LLM-as-a-judge evaluation service and a contact-centre assist programme.</w:t>
+        <w:t>Lead data engineer for all agentic AI products in the enterprise innovation team, from proof of concept to production, including a complaints investigation agent, a complaints decision-assist agent, an LLM-as-a-judge evaluation service and a contact-centre assist programme.</w:t>
       </w:r>
     </w:p>
     <w:p>
@@ -380,9 +286,9 @@
       <w:r>
         <w:rPr>
           <w:b w:val="0"/>
-          <w:sz w:val="20"/>
+          <w:sz w:val="21"/>
         </w:rPr>
-        <w:t>Built the data engineering behind decision-support workflows that cut manual case-handling time by over 90%, and an AI-assisted due-diligence capability supporting quality checks on 300+ commercial onboarding applications a day.</w:t>
+        <w:t>Complaints AutoInvestigation agent: engineered the data layer for an agent that investigates a complaint across many systems and writes an investigation summary. Built on the OpenAI Agents SDK with a 30-tool registry covering core banking, credit cards, collections and case management, fed by complaints from Kafka, with tools chosen by complaint category. Every source passes data quality checks with auditing and logging, everything the agent receives is logged as facts, and encrypted outputs are stored in PostgreSQL with controls on token usage and made-up answers.</w:t>
       </w:r>
     </w:p>
     <w:p>
@@ -393,9 +299,9 @@
       <w:r>
         <w:rPr>
           <w:b w:val="0"/>
-          <w:sz w:val="20"/>
+          <w:sz w:val="21"/>
         </w:rPr>
-        <w:t>Designed a reusable, PII-guardrailed MCP server (bounded JSON slices, role-based field allow-lists, full audit trail) that multiple agents consume with no data-access code, standardising access to core banking, CRM and case-management systems.</w:t>
+        <w:t>Customer due diligence AI checks: led data engineering on a GenAI quality-check programme for commercial customer onboarding. Designed and documented a Polars-based ETL pipeline turning onboarding Kafka payloads into structured PostgreSQL datasets for LLM-driven checks, enriched with Companies House data, supporting 300+ applications a day. Built the data-quality checks, data contracts and audit trails, and wrote the handover documentation and operations runbook.</w:t>
       </w:r>
     </w:p>
     <w:p>
@@ -406,9 +312,9 @@
       <w:r>
         <w:rPr>
           <w:b w:val="0"/>
-          <w:sz w:val="20"/>
+          <w:sz w:val="21"/>
         </w:rPr>
-        <w:t>Built RAG / retrieval and context pipelines; debugged retrieval quality at source (segment filtering, candidate-pool sizing, confidence thresholding), materially improving relevant-result recall. Cut agent data-hydration latency with warmed persistent sessions and response caching.</w:t>
+        <w:t>Designed a reusable MCP server with personal-data safeguards (it returns only small slices of data, only the fields each role may see, and keeps a full audit trail) that multiple agents use with no data-access code of their own, standardising access to core banking, CRM and case-management systems.</w:t>
       </w:r>
     </w:p>
     <w:p>
@@ -419,9 +325,9 @@
       <w:r>
         <w:rPr>
           <w:b w:val="0"/>
-          <w:sz w:val="20"/>
+          <w:sz w:val="21"/>
         </w:rPr>
-        <w:t>Built an LLM-as-a-judge evaluation pipeline (with a batch REST path) scoring model decisions into Snowflake, and PySpark pipelines on AWS EMR Serverless for model monitoring (accuracy, precision, recall, F1, LLM token usage and latency), orchestrated in Airflow.</w:t>
+        <w:t>Built RAG / retrieval and context pipelines; traced poor retrieval results back to their source and fixed them (filtering by segment, how many candidates are considered, minimum confidence cut-offs), materially improving relevant-result recall. Cut agent data-hydration latency by keeping connections open and caching responses.</w:t>
       </w:r>
     </w:p>
     <w:p>
@@ -432,9 +338,9 @@
       <w:r>
         <w:rPr>
           <w:b w:val="0"/>
-          <w:sz w:val="20"/>
+          <w:sz w:val="21"/>
         </w:rPr>
-        <w:t>Introduced Snowflake CI/CD and automated testing for data loaders; built a resilient Snowflake writer with jittered back-off, reducing deployment issues to near zero.</w:t>
+        <w:t>Built PySpark pipelines on AWS EMR Serverless for model monitoring (model accuracy, LLM token usage and latency), orchestrated by Airflow.</w:t>
       </w:r>
     </w:p>
     <w:p>
@@ -445,9 +351,9 @@
       <w:r>
         <w:rPr>
           <w:b w:val="0"/>
-          <w:sz w:val="20"/>
+          <w:sz w:val="21"/>
         </w:rPr>
-        <w:t>Designed data contracts, Pydantic validation, quality gates and audit trails to meet banking and financial-crime compliance standards; built Splunk observability for agent execution and decision quality. Deliver via GitLab CI/CD and Docker.</w:t>
+        <w:t>Introduced Snowflake CI/CD and automated testing for data loaders, and built a Snowflake writer that retries failed writes, taking deployment issues to near zero. Built Splunk observability for agent runs, tool-call performance and decision quality; deployed with GitLab CI/CD and Docker.</w:t>
       </w:r>
     </w:p>
     <w:p>
@@ -458,7 +364,26 @@
         <w:rPr>
           <w:b/>
         </w:rPr>
-        <w:t>NatWest Group, Edinburgh | Senior Data Engineer - Climate Analytics (ESG Data Platform) | Jul 2023 - Aug 2025</w:t>
+        <w:t>Senior Data Engineer - Climate Analytics (ESG Data Platform)</w:t>
+      </w:r>
+    </w:p>
+    <w:p>
+      <w:pPr>
+        <w:spacing w:after="60"/>
+      </w:pPr>
+      <w:r>
+        <w:rPr>
+          <w:b/>
+          <w:sz w:val="21"/>
+        </w:rPr>
+        <w:t>NatWest Group</w:t>
+      </w:r>
+      <w:r>
+        <w:rPr>
+          <w:b w:val="0"/>
+          <w:sz w:val="21"/>
+        </w:rPr>
+        <w:t>, Edinburgh | Jul 2023 - Aug 2025</w:t>
       </w:r>
     </w:p>
     <w:p>
@@ -469,9 +394,9 @@
       <w:r>
         <w:rPr>
           <w:b w:val="0"/>
-          <w:sz w:val="20"/>
+          <w:sz w:val="21"/>
         </w:rPr>
-        <w:t>Led a team of Data Engineers delivering NatWest's ESG and climate data platform on Snowflake: 50+ internal and external sources, 1TB+ a month, for analytics and regulatory reporting. Layered dbt project (RAW, INT, PRS, presentation) orchestrated by Airflow on AWS MWAA.</w:t>
+        <w:t>Senior engineer on the team delivering NatWest's Snowflake ESG and climate data platform on a medallion architecture: 50+ internal and external sources and 1TB+ of data a month, for analytics and regulatory reporting.</w:t>
       </w:r>
     </w:p>
     <w:p>
@@ -482,9 +407,9 @@
       <w:r>
         <w:rPr>
           <w:b w:val="0"/>
-          <w:sz w:val="20"/>
+          <w:sz w:val="21"/>
         </w:rPr>
-        <w:t>Cut batch processing times by 40% through PySpark and dbt optimisation.</w:t>
+        <w:t>Built the layered dbt project (RAW landing, INT integration and history, PRS presentation) with lineage, SCD-2 snapshots for vendor history, and dbt tests and docs as living documentation. Orchestrated on Airflow / AWS MWAA with config-driven pipelines, one per source, and tested builds promoted step by step to production.</w:t>
       </w:r>
     </w:p>
     <w:p>
@@ -495,9 +420,9 @@
       <w:r>
         <w:rPr>
           <w:b w:val="0"/>
-          <w:sz w:val="20"/>
+          <w:sz w:val="21"/>
         </w:rPr>
-        <w:t>Reduced data quality incidents by 30% with metadata-driven ingestion (new sources by config, not code), idempotent re-run guards, dbt snapshots and automated dbt tests; cut Snowflake compute cost with per-model warehouse routing and transient tables.</w:t>
+        <w:t>Controlled Snowflake spend by running each dbt model on a right-sized warehouse and using transient tables for rebuildable layers, cutting compute and storage cost.</w:t>
       </w:r>
     </w:p>
     <w:p>
@@ -508,9 +433,35 @@
       <w:r>
         <w:rPr>
           <w:b w:val="0"/>
-          <w:sz w:val="20"/>
+          <w:sz w:val="21"/>
         </w:rPr>
-        <w:t>Delivered production climate risk models with Data Architects and Data Scientists; defined engineering standards and data product frameworks; mentored junior engineers.</w:t>
+        <w:t>Made ingestion metadata-driven (a new source is a config row, not code) and idempotent, with pre-hook guards against duplicate loads and CloudWatch/SNS alerts that fail fast. Sped up batch processing through PySpark and dbt optimisation and reduced data quality incidents with automated monitoring and quality controls.</w:t>
+      </w:r>
+    </w:p>
+    <w:p>
+      <w:pPr>
+        <w:pStyle w:val="ListBullet"/>
+        <w:spacing w:after="20"/>
+      </w:pPr>
+      <w:r>
+        <w:rPr>
+          <w:b w:val="0"/>
+          <w:sz w:val="21"/>
+        </w:rPr>
+        <w:t>Delivered climate data products (emissions, residential EPC certificates and others) used by wealth, commercial and retail teams: the EPC score is shown in the NatWest app and the data feeds climate risk scores, and portfolio views by EPC band support data-backed mortgage and green-loan propositions. Each product has a named data steward, quality metrics, data contracts between producers and consumers, and lineage back to source.</w:t>
+      </w:r>
+    </w:p>
+    <w:p>
+      <w:pPr>
+        <w:pStyle w:val="ListBullet"/>
+        <w:spacing w:after="20"/>
+      </w:pPr>
+      <w:r>
+        <w:rPr>
+          <w:b w:val="0"/>
+          <w:sz w:val="21"/>
+        </w:rPr>
+        <w:t>Delivered production climate risk models with Data Architects and Data Scientists; defined engineering standards and data product frameworks; coached and mentored junior engineers on the platform and the skills they needed.</w:t>
       </w:r>
     </w:p>
     <w:p>
@@ -521,7 +472,26 @@
         <w:rPr>
           <w:b/>
         </w:rPr>
-        <w:t>NatWest Group, Edinburgh | Senior Data Engineer - Retail Analytics | Sep 2021 - Jul 2023</w:t>
+        <w:t>Senior Data Engineer - Retail Analytics</w:t>
+      </w:r>
+    </w:p>
+    <w:p>
+      <w:pPr>
+        <w:spacing w:after="60"/>
+      </w:pPr>
+      <w:r>
+        <w:rPr>
+          <w:b/>
+          <w:sz w:val="21"/>
+        </w:rPr>
+        <w:t>NatWest Group</w:t>
+      </w:r>
+      <w:r>
+        <w:rPr>
+          <w:b w:val="0"/>
+          <w:sz w:val="21"/>
+        </w:rPr>
+        <w:t>, Edinburgh | Sep 2021 - Jul 2023</w:t>
       </w:r>
     </w:p>
     <w:p>
@@ -532,9 +502,9 @@
       <w:r>
         <w:rPr>
           <w:b w:val="0"/>
-          <w:sz w:val="20"/>
+          <w:sz w:val="21"/>
         </w:rPr>
-        <w:t>Engineered enterprise batch pipelines in Python, SQL, Snowflake, PySpark and StreamSets for the Retail Data &amp; Analytics Decisioning team, including PySpark pipelines for Customer Lifetime Value analytics.</w:t>
+        <w:t>Engineered enterprise batch pipelines in Python, SQL, Snowflake, PySpark and StreamSets that move data from source to destination for the Retail Data &amp; Analytics Decisioning team, including Customer Lifetime Value analytics, building them to be idempotent and robust.</w:t>
       </w:r>
     </w:p>
     <w:p>
@@ -545,9 +515,9 @@
       <w:r>
         <w:rPr>
           <w:b w:val="0"/>
-          <w:sz w:val="20"/>
+          <w:sz w:val="21"/>
         </w:rPr>
-        <w:t>Designed Snowflake data models for high-volume analytical workloads, tuned with clustering, partitioning and materialised views.</w:t>
+        <w:t>Designed Snowflake data models for high-volume retail analytics, using clustering, partitioning and materialised views to speed up queries for Customer Lifetime Value work. Took part in the Teradata-to-Snowflake migration, including moving data marts.</w:t>
       </w:r>
     </w:p>
     <w:p>
@@ -558,7 +528,26 @@
         <w:rPr>
           <w:b/>
         </w:rPr>
-        <w:t>Tata Consultancy Services (client: Lloyds Banking Group), Manchester &amp; Gurugram | Data Engineer - Enterprise Data Platform | Jun 2019 - Sep 2021</w:t>
+        <w:t>Associate Consultant - Enterprise Data Platform</w:t>
+      </w:r>
+    </w:p>
+    <w:p>
+      <w:pPr>
+        <w:spacing w:after="60"/>
+      </w:pPr>
+      <w:r>
+        <w:rPr>
+          <w:b/>
+          <w:sz w:val="21"/>
+        </w:rPr>
+        <w:t>Tata Consultancy Services</w:t>
+      </w:r>
+      <w:r>
+        <w:rPr>
+          <w:b w:val="0"/>
+          <w:sz w:val="21"/>
+        </w:rPr>
+        <w:t xml:space="preserve"> (client: Lloyds Banking Group), Manchester &amp; Gurugram | Jun 2019 - Sep 2021</w:t>
       </w:r>
     </w:p>
     <w:p>
@@ -569,9 +558,9 @@
       <w:r>
         <w:rPr>
           <w:b w:val="0"/>
-          <w:sz w:val="20"/>
+          <w:sz w:val="21"/>
         </w:rPr>
-        <w:t>Led a 5-member Data Services team running the Lloyds enterprise data platform: Teradata warehouse, reporting applications and data support for analytics teams.</w:t>
+        <w:t>Moved into the enterprise data platform team to work on Teradata, and joined the data quality management unit, resolving issues flagged by overnight batch pipelines through the UI or the DB2 operational system on the mainframe.</w:t>
       </w:r>
     </w:p>
     <w:p>
@@ -582,9 +571,9 @@
       <w:r>
         <w:rPr>
           <w:b w:val="0"/>
-          <w:sz w:val="20"/>
+          <w:sz w:val="21"/>
         </w:rPr>
-        <w:t>Designed and delivered an ML-ready data lake on AWS for data science programmes; supported the IBM DB2 operational data store; ran a Google BigQuery proof of concept for Teradata modernisation.</w:t>
+        <w:t>Worked in an onshore-offshore delivery model, mentoring team members and managing client deliveries for the Lloyds enterprise data platform: Teradata warehouse, reporting applications, other data service applications on SQL Server and Teradata, and data support for analytics teams.</w:t>
       </w:r>
     </w:p>
     <w:p>
@@ -595,9 +584,22 @@
       <w:r>
         <w:rPr>
           <w:b w:val="0"/>
-          <w:sz w:val="20"/>
+          <w:sz w:val="21"/>
         </w:rPr>
-        <w:t>Tuned SQL and batch applications to cut CPU consumption; led Teradata upgrades and disaster recovery; gave 24/7 support for business-critical, regulatory and legal applications and resolved a critical production incident in under 12 hours.</w:t>
+        <w:t>Worked in an on-premise Teradata, Hadoop, Hive and Python environment; gathered requirements for cloud migration and tried GCP and Dataform as modernisation towards GCP began.</w:t>
+      </w:r>
+    </w:p>
+    <w:p>
+      <w:pPr>
+        <w:pStyle w:val="ListBullet"/>
+        <w:spacing w:after="20"/>
+      </w:pPr>
+      <w:r>
+        <w:rPr>
+          <w:b w:val="0"/>
+          <w:sz w:val="21"/>
+        </w:rPr>
+        <w:t>Supported batch runs and sought performance improvements wherever possible; took part in Teradata upgrades and disaster recovery.</w:t>
       </w:r>
     </w:p>
     <w:p>
@@ -608,7 +610,26 @@
         <w:rPr>
           <w:b/>
         </w:rPr>
-        <w:t>Tata Consultancy Services (client: Lloyds Banking Group) | Enterprise Data Warehouse Engineer | Feb 2016 - May 2019</w:t>
+        <w:t>Associate Consultant - Customer Information System (DB2 ODS)</w:t>
+      </w:r>
+    </w:p>
+    <w:p>
+      <w:pPr>
+        <w:spacing w:after="60"/>
+      </w:pPr>
+      <w:r>
+        <w:rPr>
+          <w:b/>
+          <w:sz w:val="21"/>
+        </w:rPr>
+        <w:t>Tata Consultancy Services</w:t>
+      </w:r>
+      <w:r>
+        <w:rPr>
+          <w:b w:val="0"/>
+          <w:sz w:val="21"/>
+        </w:rPr>
+        <w:t xml:space="preserve"> (client: Lloyds Banking Group) | Feb 2016 - May 2019</w:t>
       </w:r>
     </w:p>
     <w:p>
@@ -619,9 +640,22 @@
       <w:r>
         <w:rPr>
           <w:b w:val="0"/>
-          <w:sz w:val="20"/>
+          <w:sz w:val="21"/>
         </w:rPr>
-        <w:t>Built ETL pipelines that cut data load times by 50%; implemented a GDPR-compliant data governance framework that reduced data errors by 45%.</w:t>
+        <w:t>Supported the IBM DB2 operational data store behind the customer information system: managed data quality incidents, including customer profile merge and unmerge issues.</w:t>
+      </w:r>
+    </w:p>
+    <w:p>
+      <w:pPr>
+        <w:pStyle w:val="ListBullet"/>
+        <w:spacing w:after="20"/>
+      </w:pPr>
+      <w:r>
+        <w:rPr>
+          <w:b w:val="0"/>
+          <w:sz w:val="21"/>
+        </w:rPr>
+        <w:t>Worked on data warehousing and big data across the DB2 operational data store, Teradata and Hadoop.</w:t>
       </w:r>
     </w:p>
     <w:p>
@@ -632,7 +666,40 @@
         <w:rPr>
           <w:b/>
         </w:rPr>
-        <w:t>UST Global, Gurugram | Senior Software Engineer (Mainframe) | Apr 2015 - Feb 2016</w:t>
+        <w:t>Software Engineer, Mainframe (Senior from 2015)</w:t>
+      </w:r>
+    </w:p>
+    <w:p>
+      <w:pPr>
+        <w:spacing w:after="60"/>
+      </w:pPr>
+      <w:r>
+        <w:rPr>
+          <w:b/>
+          <w:sz w:val="21"/>
+        </w:rPr>
+        <w:t>UST Global</w:t>
+      </w:r>
+      <w:r>
+        <w:rPr>
+          <w:b w:val="0"/>
+          <w:sz w:val="21"/>
+        </w:rPr>
+        <w:t xml:space="preserve">, Gurugram | Apr 2015 - Feb 2016, and </w:t>
+      </w:r>
+      <w:r>
+        <w:rPr>
+          <w:b/>
+          <w:sz w:val="21"/>
+        </w:rPr>
+        <w:t>Sopra Steria</w:t>
+      </w:r>
+      <w:r>
+        <w:rPr>
+          <w:b w:val="0"/>
+          <w:sz w:val="21"/>
+        </w:rPr>
+        <w:t>, Noida | Apr 2011 - Mar 2015</w:t>
       </w:r>
     </w:p>
     <w:p>
@@ -643,33 +710,9 @@
       <w:r>
         <w:rPr>
           <w:b w:val="0"/>
-          <w:sz w:val="20"/>
+          <w:sz w:val="21"/>
         </w:rPr>
-        <w:t>Built and supported COBOL / DB2 mainframe applications under ITIL incident, problem and change management; contributed to high-level designs with business analysts and mentored junior team members.</w:t>
-      </w:r>
-    </w:p>
-    <w:p>
-      <w:pPr>
-        <w:spacing w:before="120" w:after="0"/>
-      </w:pPr>
-      <w:r>
-        <w:rPr>
-          <w:b/>
-        </w:rPr>
-        <w:t>Sopra Steria, Noida | Software Engineer (Mainframe) | Apr 2011 - Mar 2015</w:t>
-      </w:r>
-    </w:p>
-    <w:p>
-      <w:pPr>
-        <w:pStyle w:val="ListBullet"/>
-        <w:spacing w:after="20"/>
-      </w:pPr>
-      <w:r>
-        <w:rPr>
-          <w:b w:val="0"/>
-          <w:sz w:val="20"/>
-        </w:rPr>
-        <w:t>Trained in mainframe technology, then built and supported COBOL / DB2 systems for a UK retailer; prepared detailed designs from business requirements under ITIL processes.</w:t>
+        <w:t>Trained in mainframe technology, then built and supported COBOL / DB2 systems for a UK retailer and later at UST Global under ITIL processes; prepared designs with business analysts and mentored junior team members.</w:t>
       </w:r>
     </w:p>
     <w:p>
@@ -695,7 +738,7 @@
       <w:r>
         <w:rPr>
           <w:b w:val="0"/>
-          <w:sz w:val="20"/>
+          <w:sz w:val="21"/>
         </w:rPr>
         <w:t>B.Tech, Computer Science, Gautam Buddh Technical University, India (2006 - 2010)</w:t>
       </w:r>
@@ -708,14 +751,14 @@
       <w:r>
         <w:rPr>
           <w:b w:val="0"/>
-          <w:sz w:val="20"/>
+          <w:sz w:val="21"/>
         </w:rPr>
-        <w:t>Big Data on AWS, Amazon Web Services (May 2022) | Data Engineering Nanodegree, Udacity (May 2022) | Google Cloud Engineering Specialization, Coursera</w:t>
+        <w:t>Certifications: Big Data on AWS (Amazon Web Services, May 2022); Data Engineering Nanodegree (Udacity, May 2022); Google Cloud Engineering Specialization (Coursera)</w:t>
       </w:r>
     </w:p>
     <w:sectPr>
       <w:pgSz w:w="12240" w:h="15840"/>
-      <w:pgMar w:top="737" w:right="907" w:bottom="737" w:left="907" w:header="720" w:footer="720" w:gutter="0"/>
+      <w:pgMar w:top="907" w:right="1020" w:bottom="907" w:left="1020" w:header="720" w:footer="720" w:gutter="0"/>
       <w:cols w:space="720"/>
       <w:docGrid w:linePitch="360"/>
     </w:sectPr>

</xml_diff>